<commit_message>
feat: rewrite pipeline to use LUT; downscale_4x removed and functionality moved to vga_timing.sv; LUT2VGA renamed to LUT2RGB; minor changes in interfaces
</commit_message>
<xml_diff>
--- a/doc/checklist.docx
+++ b/doc/checklist.docx
@@ -66,7 +66,7 @@
       </w:r>
       <w:r>
         <w:rPr/>
-        <w:t>16.05.2026</w:t>
+        <w:t>20.05.2026</w:t>
       </w:r>
       <w:r>
         <w:rPr/>
@@ -96,15 +96,15 @@
         </w:tblCellMar>
       </w:tblPr>
       <w:tblGrid>
-        <w:gridCol w:w="6652"/>
-        <w:gridCol w:w="1496"/>
+        <w:gridCol w:w="6651"/>
+        <w:gridCol w:w="1497"/>
         <w:gridCol w:w="1495"/>
       </w:tblGrid>
       <w:tr>
         <w:trPr/>
         <w:tc>
           <w:tcPr>
-            <w:tcW w:w="6652" w:type="dxa"/>
+            <w:tcW w:w="6651" w:type="dxa"/>
             <w:tcBorders>
               <w:top w:val="single" w:sz="2" w:space="0" w:color="000000"/>
               <w:left w:val="single" w:sz="2" w:space="0" w:color="000000"/>
@@ -143,7 +143,7 @@
         </w:tc>
         <w:tc>
           <w:tcPr>
-            <w:tcW w:w="1496" w:type="dxa"/>
+            <w:tcW w:w="1497" w:type="dxa"/>
             <w:tcBorders>
               <w:top w:val="single" w:sz="2" w:space="0" w:color="000000"/>
               <w:left w:val="single" w:sz="2" w:space="0" w:color="000000"/>
@@ -225,7 +225,7 @@
         <w:trPr/>
         <w:tc>
           <w:tcPr>
-            <w:tcW w:w="6652" w:type="dxa"/>
+            <w:tcW w:w="6651" w:type="dxa"/>
             <w:tcBorders>
               <w:left w:val="single" w:sz="2" w:space="0" w:color="000000"/>
               <w:bottom w:val="single" w:sz="2" w:space="0" w:color="000000"/>
@@ -252,7 +252,7 @@
         </w:tc>
         <w:tc>
           <w:tcPr>
-            <w:tcW w:w="1496" w:type="dxa"/>
+            <w:tcW w:w="1497" w:type="dxa"/>
             <w:tcBorders>
               <w:left w:val="single" w:sz="2" w:space="0" w:color="000000"/>
               <w:bottom w:val="single" w:sz="2" w:space="0" w:color="000000"/>
@@ -312,7 +312,7 @@
         <w:trPr/>
         <w:tc>
           <w:tcPr>
-            <w:tcW w:w="6652" w:type="dxa"/>
+            <w:tcW w:w="6651" w:type="dxa"/>
             <w:tcBorders>
               <w:left w:val="single" w:sz="2" w:space="0" w:color="000000"/>
               <w:bottom w:val="single" w:sz="2" w:space="0" w:color="000000"/>
@@ -357,7 +357,7 @@
         </w:tc>
         <w:tc>
           <w:tcPr>
-            <w:tcW w:w="1496" w:type="dxa"/>
+            <w:tcW w:w="1497" w:type="dxa"/>
             <w:tcBorders>
               <w:left w:val="single" w:sz="2" w:space="0" w:color="000000"/>
               <w:bottom w:val="single" w:sz="2" w:space="0" w:color="000000"/>
@@ -417,7 +417,7 @@
         <w:trPr/>
         <w:tc>
           <w:tcPr>
-            <w:tcW w:w="6652" w:type="dxa"/>
+            <w:tcW w:w="6651" w:type="dxa"/>
             <w:tcBorders>
               <w:left w:val="single" w:sz="2" w:space="0" w:color="000000"/>
               <w:bottom w:val="single" w:sz="2" w:space="0" w:color="000000"/>
@@ -444,7 +444,7 @@
         </w:tc>
         <w:tc>
           <w:tcPr>
-            <w:tcW w:w="1496" w:type="dxa"/>
+            <w:tcW w:w="1497" w:type="dxa"/>
             <w:tcBorders>
               <w:left w:val="single" w:sz="2" w:space="0" w:color="000000"/>
               <w:bottom w:val="single" w:sz="2" w:space="0" w:color="000000"/>
@@ -503,7 +503,7 @@
         <w:trPr/>
         <w:tc>
           <w:tcPr>
-            <w:tcW w:w="6652" w:type="dxa"/>
+            <w:tcW w:w="6651" w:type="dxa"/>
             <w:tcBorders>
               <w:left w:val="single" w:sz="2" w:space="0" w:color="000000"/>
               <w:bottom w:val="single" w:sz="2" w:space="0" w:color="000000"/>
@@ -530,7 +530,7 @@
         </w:tc>
         <w:tc>
           <w:tcPr>
-            <w:tcW w:w="1496" w:type="dxa"/>
+            <w:tcW w:w="1497" w:type="dxa"/>
             <w:tcBorders>
               <w:left w:val="single" w:sz="2" w:space="0" w:color="000000"/>
               <w:bottom w:val="single" w:sz="2" w:space="0" w:color="000000"/>
@@ -589,7 +589,7 @@
         <w:trPr/>
         <w:tc>
           <w:tcPr>
-            <w:tcW w:w="6652" w:type="dxa"/>
+            <w:tcW w:w="6651" w:type="dxa"/>
             <w:tcBorders>
               <w:left w:val="single" w:sz="2" w:space="0" w:color="000000"/>
               <w:bottom w:val="single" w:sz="2" w:space="0" w:color="000000"/>
@@ -616,7 +616,7 @@
         </w:tc>
         <w:tc>
           <w:tcPr>
-            <w:tcW w:w="1496" w:type="dxa"/>
+            <w:tcW w:w="1497" w:type="dxa"/>
             <w:tcBorders>
               <w:left w:val="single" w:sz="2" w:space="0" w:color="000000"/>
               <w:bottom w:val="single" w:sz="2" w:space="0" w:color="000000"/>
@@ -665,15 +665,7 @@
                 <w:szCs w:val="22"/>
                 <w:lang w:val="pl-PL"/>
               </w:rPr>
-              <w:t>2025.</w:t>
-            </w:r>
-            <w:r>
-              <w:rPr>
-                <w:sz w:val="22"/>
-                <w:szCs w:val="22"/>
-                <w:lang w:val="pl-PL"/>
-              </w:rPr>
-              <w:t>2</w:t>
+              <w:t>2025.2</w:t>
             </w:r>
           </w:p>
         </w:tc>
@@ -682,7 +674,7 @@
         <w:trPr/>
         <w:tc>
           <w:tcPr>
-            <w:tcW w:w="6652" w:type="dxa"/>
+            <w:tcW w:w="6651" w:type="dxa"/>
             <w:tcBorders>
               <w:left w:val="single" w:sz="2" w:space="0" w:color="000000"/>
               <w:bottom w:val="single" w:sz="2" w:space="0" w:color="000000"/>
@@ -709,7 +701,7 @@
         </w:tc>
         <w:tc>
           <w:tcPr>
-            <w:tcW w:w="1496" w:type="dxa"/>
+            <w:tcW w:w="1497" w:type="dxa"/>
             <w:tcBorders>
               <w:left w:val="single" w:sz="2" w:space="0" w:color="000000"/>
               <w:bottom w:val="single" w:sz="2" w:space="0" w:color="000000"/>
@@ -769,7 +761,7 @@
         <w:trPr/>
         <w:tc>
           <w:tcPr>
-            <w:tcW w:w="6652" w:type="dxa"/>
+            <w:tcW w:w="6651" w:type="dxa"/>
             <w:tcBorders>
               <w:left w:val="single" w:sz="2" w:space="0" w:color="000000"/>
               <w:bottom w:val="single" w:sz="2" w:space="0" w:color="000000"/>
@@ -810,7 +802,7 @@
         </w:tc>
         <w:tc>
           <w:tcPr>
-            <w:tcW w:w="1496" w:type="dxa"/>
+            <w:tcW w:w="1497" w:type="dxa"/>
             <w:tcBorders>
               <w:left w:val="single" w:sz="2" w:space="0" w:color="000000"/>
               <w:bottom w:val="single" w:sz="2" w:space="0" w:color="000000"/>
@@ -870,7 +862,7 @@
         <w:trPr/>
         <w:tc>
           <w:tcPr>
-            <w:tcW w:w="6652" w:type="dxa"/>
+            <w:tcW w:w="6651" w:type="dxa"/>
             <w:tcBorders>
               <w:left w:val="single" w:sz="2" w:space="0" w:color="000000"/>
               <w:bottom w:val="single" w:sz="2" w:space="0" w:color="000000"/>
@@ -911,7 +903,7 @@
         </w:tc>
         <w:tc>
           <w:tcPr>
-            <w:tcW w:w="1496" w:type="dxa"/>
+            <w:tcW w:w="1497" w:type="dxa"/>
             <w:tcBorders>
               <w:left w:val="single" w:sz="2" w:space="0" w:color="000000"/>
               <w:bottom w:val="single" w:sz="2" w:space="0" w:color="000000"/>
@@ -960,7 +952,7 @@
                 <w:szCs w:val="22"/>
                 <w:lang w:val="pl-PL"/>
               </w:rPr>
-              <w:t>0</w:t>
+              <w:t>19</w:t>
             </w:r>
           </w:p>
         </w:tc>
@@ -969,7 +961,7 @@
         <w:trPr/>
         <w:tc>
           <w:tcPr>
-            <w:tcW w:w="6652" w:type="dxa"/>
+            <w:tcW w:w="6651" w:type="dxa"/>
             <w:tcBorders>
               <w:left w:val="single" w:sz="2" w:space="0" w:color="000000"/>
               <w:bottom w:val="single" w:sz="2" w:space="0" w:color="000000"/>
@@ -996,7 +988,7 @@
         </w:tc>
         <w:tc>
           <w:tcPr>
-            <w:tcW w:w="1496" w:type="dxa"/>
+            <w:tcW w:w="1497" w:type="dxa"/>
             <w:tcBorders>
               <w:left w:val="single" w:sz="2" w:space="0" w:color="000000"/>
               <w:bottom w:val="single" w:sz="2" w:space="0" w:color="000000"/>
@@ -1054,7 +1046,7 @@
         <w:trPr/>
         <w:tc>
           <w:tcPr>
-            <w:tcW w:w="6652" w:type="dxa"/>
+            <w:tcW w:w="6651" w:type="dxa"/>
             <w:tcBorders>
               <w:left w:val="single" w:sz="2" w:space="0" w:color="000000"/>
               <w:bottom w:val="single" w:sz="2" w:space="0" w:color="000000"/>
@@ -1081,7 +1073,7 @@
         </w:tc>
         <w:tc>
           <w:tcPr>
-            <w:tcW w:w="1496" w:type="dxa"/>
+            <w:tcW w:w="1497" w:type="dxa"/>
             <w:tcBorders>
               <w:left w:val="single" w:sz="2" w:space="0" w:color="000000"/>
               <w:bottom w:val="single" w:sz="2" w:space="0" w:color="000000"/>
@@ -1141,7 +1133,7 @@
         <w:trPr/>
         <w:tc>
           <w:tcPr>
-            <w:tcW w:w="6652" w:type="dxa"/>
+            <w:tcW w:w="6651" w:type="dxa"/>
             <w:tcBorders>
               <w:left w:val="single" w:sz="2" w:space="0" w:color="000000"/>
               <w:bottom w:val="single" w:sz="2" w:space="0" w:color="000000"/>
@@ -1168,7 +1160,7 @@
         </w:tc>
         <w:tc>
           <w:tcPr>
-            <w:tcW w:w="1496" w:type="dxa"/>
+            <w:tcW w:w="1497" w:type="dxa"/>
             <w:tcBorders>
               <w:left w:val="single" w:sz="2" w:space="0" w:color="000000"/>
               <w:bottom w:val="single" w:sz="2" w:space="0" w:color="000000"/>
@@ -1217,6 +1209,7 @@
                 <w:szCs w:val="22"/>
                 <w:lang w:val="pl-PL"/>
               </w:rPr>
+              <w:t>1024px/768px</w:t>
             </w:r>
           </w:p>
         </w:tc>
@@ -1225,7 +1218,7 @@
         <w:trPr/>
         <w:tc>
           <w:tcPr>
-            <w:tcW w:w="6652" w:type="dxa"/>
+            <w:tcW w:w="6651" w:type="dxa"/>
             <w:tcBorders>
               <w:left w:val="single" w:sz="2" w:space="0" w:color="000000"/>
               <w:bottom w:val="single" w:sz="2" w:space="0" w:color="000000"/>
@@ -1252,7 +1245,7 @@
         </w:tc>
         <w:tc>
           <w:tcPr>
-            <w:tcW w:w="1496" w:type="dxa"/>
+            <w:tcW w:w="1497" w:type="dxa"/>
             <w:tcBorders>
               <w:left w:val="single" w:sz="2" w:space="0" w:color="000000"/>
               <w:bottom w:val="single" w:sz="2" w:space="0" w:color="000000"/>
@@ -1311,7 +1304,7 @@
         <w:trPr/>
         <w:tc>
           <w:tcPr>
-            <w:tcW w:w="6652" w:type="dxa"/>
+            <w:tcW w:w="6651" w:type="dxa"/>
             <w:tcBorders>
               <w:left w:val="single" w:sz="2" w:space="0" w:color="000000"/>
               <w:bottom w:val="single" w:sz="2" w:space="0" w:color="000000"/>
@@ -1338,7 +1331,7 @@
         </w:tc>
         <w:tc>
           <w:tcPr>
-            <w:tcW w:w="1496" w:type="dxa"/>
+            <w:tcW w:w="1497" w:type="dxa"/>
             <w:tcBorders>
               <w:left w:val="single" w:sz="2" w:space="0" w:color="000000"/>
               <w:bottom w:val="single" w:sz="2" w:space="0" w:color="000000"/>
@@ -1387,6 +1380,7 @@
                 <w:szCs w:val="22"/>
                 <w:lang w:val="pl-PL"/>
               </w:rPr>
+              <w:t>BTNC</w:t>
             </w:r>
           </w:p>
         </w:tc>
@@ -1395,7 +1389,7 @@
         <w:trPr/>
         <w:tc>
           <w:tcPr>
-            <w:tcW w:w="6652" w:type="dxa"/>
+            <w:tcW w:w="6651" w:type="dxa"/>
             <w:tcBorders>
               <w:left w:val="single" w:sz="2" w:space="0" w:color="000000"/>
               <w:bottom w:val="single" w:sz="2" w:space="0" w:color="000000"/>
@@ -1422,7 +1416,7 @@
         </w:tc>
         <w:tc>
           <w:tcPr>
-            <w:tcW w:w="1496" w:type="dxa"/>
+            <w:tcW w:w="1497" w:type="dxa"/>
             <w:tcBorders>
               <w:left w:val="single" w:sz="2" w:space="0" w:color="000000"/>
               <w:bottom w:val="single" w:sz="2" w:space="0" w:color="000000"/>
@@ -1471,6 +1465,7 @@
                 <w:szCs w:val="22"/>
                 <w:lang w:val="pl-PL"/>
               </w:rPr>
+              <w:t>TAK</w:t>
             </w:r>
           </w:p>
         </w:tc>
@@ -1479,33 +1474,33 @@
         <w:trPr/>
         <w:tc>
           <w:tcPr>
-            <w:tcW w:w="6652" w:type="dxa"/>
-            <w:tcBorders>
-              <w:left w:val="single" w:sz="2" w:space="0" w:color="000000"/>
-              <w:bottom w:val="single" w:sz="2" w:space="0" w:color="000000"/>
-            </w:tcBorders>
-          </w:tcPr>
-          <w:p>
-            <w:pPr>
-              <w:pStyle w:val="TableContents"/>
-              <w:rPr>
-                <w:sz w:val="22"/>
-                <w:szCs w:val="22"/>
-                <w:lang w:val="pl-PL"/>
-              </w:rPr>
-            </w:pPr>
-            <w:r>
-              <w:rPr>
-                <w:sz w:val="22"/>
-                <w:szCs w:val="22"/>
-                <w:lang w:val="pl-PL"/>
-              </w:rPr>
-            </w:r>
-          </w:p>
-        </w:tc>
-        <w:tc>
-          <w:tcPr>
-            <w:tcW w:w="1496" w:type="dxa"/>
+            <w:tcW w:w="6651" w:type="dxa"/>
+            <w:tcBorders>
+              <w:left w:val="single" w:sz="2" w:space="0" w:color="000000"/>
+              <w:bottom w:val="single" w:sz="2" w:space="0" w:color="000000"/>
+            </w:tcBorders>
+          </w:tcPr>
+          <w:p>
+            <w:pPr>
+              <w:pStyle w:val="TableContents"/>
+              <w:rPr>
+                <w:sz w:val="22"/>
+                <w:szCs w:val="22"/>
+                <w:lang w:val="pl-PL"/>
+              </w:rPr>
+            </w:pPr>
+            <w:r>
+              <w:rPr>
+                <w:sz w:val="22"/>
+                <w:szCs w:val="22"/>
+                <w:lang w:val="pl-PL"/>
+              </w:rPr>
+            </w:r>
+          </w:p>
+        </w:tc>
+        <w:tc>
+          <w:tcPr>
+            <w:tcW w:w="1497" w:type="dxa"/>
             <w:tcBorders>
               <w:left w:val="single" w:sz="2" w:space="0" w:color="000000"/>
               <w:bottom w:val="single" w:sz="2" w:space="0" w:color="000000"/>
@@ -1612,7 +1607,9 @@
       </w:r>
     </w:p>
     <w:sectPr>
-      <w:headerReference w:type="default" r:id="rId2"/>
+      <w:headerReference w:type="even" r:id="rId2"/>
+      <w:headerReference w:type="default" r:id="rId3"/>
+      <w:headerReference w:type="first" r:id="rId4"/>
       <w:type w:val="nextPage"/>
       <w:pgSz w:w="11906" w:h="16838"/>
       <w:pgMar w:left="1134" w:right="1134" w:gutter="0" w:header="708" w:top="1134" w:footer="0" w:bottom="1134"/>
@@ -1626,6 +1623,20 @@
 </file>
 
 <file path=word/header1.xml><?xml version="1.0" encoding="utf-8"?>
+<w:hdr xmlns:o="urn:schemas-microsoft-com:office:office" xmlns:r="http://schemas.openxmlformats.org/officeDocument/2006/relationships" xmlns:v="urn:schemas-microsoft-com:vml" xmlns:w="http://schemas.openxmlformats.org/wordprocessingml/2006/main" xmlns:w10="urn:schemas-microsoft-com:office:word" xmlns:wp="http://schemas.openxmlformats.org/drawingml/2006/wordprocessingDrawing" xmlns:pic="http://schemas.openxmlformats.org/drawingml/2006/picture" xmlns:wps="http://schemas.microsoft.com/office/word/2010/wordprocessingShape" xmlns:wpg="http://schemas.microsoft.com/office/word/2010/wordprocessingGroup" xmlns:mc="http://schemas.openxmlformats.org/markup-compatibility/2006" xmlns:wp14="http://schemas.microsoft.com/office/word/2010/wordprocessingDrawing" xmlns:w14="http://schemas.microsoft.com/office/word/2010/wordml" xmlns:w15="http://schemas.microsoft.com/office/word/2012/wordml" mc:Ignorable="w14 wp14 w15">
+  <w:p>
+    <w:pPr>
+      <w:pStyle w:val="Header"/>
+      <w:rPr/>
+    </w:pPr>
+    <w:r>
+      <w:rPr/>
+    </w:r>
+  </w:p>
+</w:hdr>
+</file>
+
+<file path=word/header2.xml><?xml version="1.0" encoding="utf-8"?>
 <w:hdr xmlns:o="urn:schemas-microsoft-com:office:office" xmlns:r="http://schemas.openxmlformats.org/officeDocument/2006/relationships" xmlns:v="urn:schemas-microsoft-com:vml" xmlns:w="http://schemas.openxmlformats.org/wordprocessingml/2006/main" xmlns:w10="urn:schemas-microsoft-com:office:word" xmlns:wp="http://schemas.openxmlformats.org/drawingml/2006/wordprocessingDrawing" xmlns:pic="http://schemas.openxmlformats.org/drawingml/2006/picture" xmlns:wps="http://schemas.microsoft.com/office/word/2010/wordprocessingShape" xmlns:wpg="http://schemas.microsoft.com/office/word/2010/wordprocessingGroup" xmlns:mc="http://schemas.openxmlformats.org/markup-compatibility/2006" xmlns:wp14="http://schemas.microsoft.com/office/word/2010/wordprocessingDrawing" xmlns:w14="http://schemas.microsoft.com/office/word/2010/wordml" xmlns:w15="http://schemas.microsoft.com/office/word/2012/wordml" mc:Ignorable="w14 wp14 w15">
   <w:p>
     <w:pPr>
@@ -1650,7 +1661,52 @@
     </w:r>
     <w:r>
       <w:rPr/>
-      <w:t>16.05.2026</w:t>
+      <w:t>20.05.2026</w:t>
+    </w:r>
+    <w:r>
+      <w:rPr/>
+      <w:fldChar w:fldCharType="end"/>
+    </w:r>
+    <w:r>
+      <w:rPr/>
+      <w:tab/>
+    </w:r>
+    <w:r>
+      <w:rPr>
+        <w:lang w:val="pl-PL"/>
+      </w:rPr>
+      <w:t>Lista kontrolna projektu</w:t>
+    </w:r>
+  </w:p>
+</w:hdr>
+</file>
+
+<file path=word/header3.xml><?xml version="1.0" encoding="utf-8"?>
+<w:hdr xmlns:o="urn:schemas-microsoft-com:office:office" xmlns:r="http://schemas.openxmlformats.org/officeDocument/2006/relationships" xmlns:v="urn:schemas-microsoft-com:vml" xmlns:w="http://schemas.openxmlformats.org/wordprocessingml/2006/main" xmlns:w10="urn:schemas-microsoft-com:office:word" xmlns:wp="http://schemas.openxmlformats.org/drawingml/2006/wordprocessingDrawing" xmlns:pic="http://schemas.openxmlformats.org/drawingml/2006/picture" xmlns:wps="http://schemas.microsoft.com/office/word/2010/wordprocessingShape" xmlns:wpg="http://schemas.microsoft.com/office/word/2010/wordprocessingGroup" xmlns:mc="http://schemas.openxmlformats.org/markup-compatibility/2006" xmlns:wp14="http://schemas.microsoft.com/office/word/2010/wordprocessingDrawing" xmlns:w14="http://schemas.microsoft.com/office/word/2010/wordml" xmlns:w15="http://schemas.microsoft.com/office/word/2012/wordml" mc:Ignorable="w14 wp14 w15">
+  <w:p>
+    <w:pPr>
+      <w:pStyle w:val="Header"/>
+      <w:rPr/>
+    </w:pPr>
+    <w:r>
+      <w:rPr/>
+      <w:t xml:space="preserve">MTM UEC2 </w:t>
+    </w:r>
+    <w:r>
+      <w:rPr/>
+      <w:fldChar w:fldCharType="begin"/>
+    </w:r>
+    <w:r>
+      <w:rPr/>
+      <w:instrText xml:space="preserve"> DATE \@"dd\.MM\.yyyy" </w:instrText>
+    </w:r>
+    <w:r>
+      <w:rPr/>
+      <w:fldChar w:fldCharType="separate"/>
+    </w:r>
+    <w:r>
+      <w:rPr/>
+      <w:t>20.05.2026</w:t>
     </w:r>
     <w:r>
       <w:rPr/>
@@ -1694,9 +1750,7 @@
     <w:pPr>
       <w:widowControl/>
       <w:suppressAutoHyphens w:val="true"/>
-      <w:kinsoku w:val="true"/>
-      <w:overflowPunct w:val="true"/>
-      <w:autoSpaceDE w:val="true"/>
+      <w:overflowPunct w:val="false"/>
       <w:bidi w:val="0"/>
       <w:spacing w:before="0" w:after="0"/>
       <w:jc w:val="left"/>
@@ -1717,10 +1771,6 @@
     <w:next w:val="Textbody"/>
     <w:qFormat/>
     <w:pPr>
-      <w:numPr>
-        <w:ilvl w:val="0"/>
-        <w:numId w:val="0"/>
-      </w:numPr>
       <w:outlineLvl w:val="0"/>
     </w:pPr>
     <w:rPr>
@@ -1738,8 +1788,8 @@
     <w:qFormat/>
     <w:rPr/>
   </w:style>
-  <w:style w:type="character" w:styleId="Bulletsuser">
-    <w:name w:val="Bullets (user)"/>
+  <w:style w:type="character" w:styleId="Bullets">
+    <w:name w:val="Bullets"/>
     <w:qFormat/>
     <w:rPr>
       <w:rFonts w:ascii="OpenSymbol" w:hAnsi="OpenSymbol" w:eastAsia="OpenSymbol" w:cs="OpenSymbol"/>
@@ -1811,9 +1861,7 @@
     <w:pPr>
       <w:widowControl/>
       <w:suppressAutoHyphens w:val="true"/>
-      <w:kinsoku w:val="true"/>
-      <w:overflowPunct w:val="true"/>
-      <w:autoSpaceDE w:val="true"/>
+      <w:overflowPunct w:val="false"/>
       <w:bidi w:val="0"/>
       <w:spacing w:before="0" w:after="0"/>
       <w:jc w:val="left"/>

</xml_diff>

<commit_message>
feat: simple background with clouds and grandstand
</commit_message>
<xml_diff>
--- a/doc/checklist.docx
+++ b/doc/checklist.docx
@@ -66,7 +66,7 @@
       </w:r>
       <w:r>
         <w:rPr/>
-        <w:t>20.05.2026</w:t>
+        <w:t>21.05.2026</w:t>
       </w:r>
       <w:r>
         <w:rPr/>
@@ -96,15 +96,15 @@
         </w:tblCellMar>
       </w:tblPr>
       <w:tblGrid>
-        <w:gridCol w:w="6651"/>
-        <w:gridCol w:w="1497"/>
+        <w:gridCol w:w="6650"/>
+        <w:gridCol w:w="1498"/>
         <w:gridCol w:w="1495"/>
       </w:tblGrid>
       <w:tr>
         <w:trPr/>
         <w:tc>
           <w:tcPr>
-            <w:tcW w:w="6651" w:type="dxa"/>
+            <w:tcW w:w="6650" w:type="dxa"/>
             <w:tcBorders>
               <w:top w:val="single" w:sz="2" w:space="0" w:color="000000"/>
               <w:left w:val="single" w:sz="2" w:space="0" w:color="000000"/>
@@ -143,7 +143,7 @@
         </w:tc>
         <w:tc>
           <w:tcPr>
-            <w:tcW w:w="1497" w:type="dxa"/>
+            <w:tcW w:w="1498" w:type="dxa"/>
             <w:tcBorders>
               <w:top w:val="single" w:sz="2" w:space="0" w:color="000000"/>
               <w:left w:val="single" w:sz="2" w:space="0" w:color="000000"/>
@@ -225,7 +225,7 @@
         <w:trPr/>
         <w:tc>
           <w:tcPr>
-            <w:tcW w:w="6651" w:type="dxa"/>
+            <w:tcW w:w="6650" w:type="dxa"/>
             <w:tcBorders>
               <w:left w:val="single" w:sz="2" w:space="0" w:color="000000"/>
               <w:bottom w:val="single" w:sz="2" w:space="0" w:color="000000"/>
@@ -252,7 +252,7 @@
         </w:tc>
         <w:tc>
           <w:tcPr>
-            <w:tcW w:w="1497" w:type="dxa"/>
+            <w:tcW w:w="1498" w:type="dxa"/>
             <w:tcBorders>
               <w:left w:val="single" w:sz="2" w:space="0" w:color="000000"/>
               <w:bottom w:val="single" w:sz="2" w:space="0" w:color="000000"/>
@@ -312,7 +312,7 @@
         <w:trPr/>
         <w:tc>
           <w:tcPr>
-            <w:tcW w:w="6651" w:type="dxa"/>
+            <w:tcW w:w="6650" w:type="dxa"/>
             <w:tcBorders>
               <w:left w:val="single" w:sz="2" w:space="0" w:color="000000"/>
               <w:bottom w:val="single" w:sz="2" w:space="0" w:color="000000"/>
@@ -357,7 +357,7 @@
         </w:tc>
         <w:tc>
           <w:tcPr>
-            <w:tcW w:w="1497" w:type="dxa"/>
+            <w:tcW w:w="1498" w:type="dxa"/>
             <w:tcBorders>
               <w:left w:val="single" w:sz="2" w:space="0" w:color="000000"/>
               <w:bottom w:val="single" w:sz="2" w:space="0" w:color="000000"/>
@@ -417,7 +417,7 @@
         <w:trPr/>
         <w:tc>
           <w:tcPr>
-            <w:tcW w:w="6651" w:type="dxa"/>
+            <w:tcW w:w="6650" w:type="dxa"/>
             <w:tcBorders>
               <w:left w:val="single" w:sz="2" w:space="0" w:color="000000"/>
               <w:bottom w:val="single" w:sz="2" w:space="0" w:color="000000"/>
@@ -444,7 +444,7 @@
         </w:tc>
         <w:tc>
           <w:tcPr>
-            <w:tcW w:w="1497" w:type="dxa"/>
+            <w:tcW w:w="1498" w:type="dxa"/>
             <w:tcBorders>
               <w:left w:val="single" w:sz="2" w:space="0" w:color="000000"/>
               <w:bottom w:val="single" w:sz="2" w:space="0" w:color="000000"/>
@@ -503,7 +503,7 @@
         <w:trPr/>
         <w:tc>
           <w:tcPr>
-            <w:tcW w:w="6651" w:type="dxa"/>
+            <w:tcW w:w="6650" w:type="dxa"/>
             <w:tcBorders>
               <w:left w:val="single" w:sz="2" w:space="0" w:color="000000"/>
               <w:bottom w:val="single" w:sz="2" w:space="0" w:color="000000"/>
@@ -530,7 +530,7 @@
         </w:tc>
         <w:tc>
           <w:tcPr>
-            <w:tcW w:w="1497" w:type="dxa"/>
+            <w:tcW w:w="1498" w:type="dxa"/>
             <w:tcBorders>
               <w:left w:val="single" w:sz="2" w:space="0" w:color="000000"/>
               <w:bottom w:val="single" w:sz="2" w:space="0" w:color="000000"/>
@@ -589,7 +589,7 @@
         <w:trPr/>
         <w:tc>
           <w:tcPr>
-            <w:tcW w:w="6651" w:type="dxa"/>
+            <w:tcW w:w="6650" w:type="dxa"/>
             <w:tcBorders>
               <w:left w:val="single" w:sz="2" w:space="0" w:color="000000"/>
               <w:bottom w:val="single" w:sz="2" w:space="0" w:color="000000"/>
@@ -616,7 +616,7 @@
         </w:tc>
         <w:tc>
           <w:tcPr>
-            <w:tcW w:w="1497" w:type="dxa"/>
+            <w:tcW w:w="1498" w:type="dxa"/>
             <w:tcBorders>
               <w:left w:val="single" w:sz="2" w:space="0" w:color="000000"/>
               <w:bottom w:val="single" w:sz="2" w:space="0" w:color="000000"/>
@@ -674,7 +674,7 @@
         <w:trPr/>
         <w:tc>
           <w:tcPr>
-            <w:tcW w:w="6651" w:type="dxa"/>
+            <w:tcW w:w="6650" w:type="dxa"/>
             <w:tcBorders>
               <w:left w:val="single" w:sz="2" w:space="0" w:color="000000"/>
               <w:bottom w:val="single" w:sz="2" w:space="0" w:color="000000"/>
@@ -701,7 +701,7 @@
         </w:tc>
         <w:tc>
           <w:tcPr>
-            <w:tcW w:w="1497" w:type="dxa"/>
+            <w:tcW w:w="1498" w:type="dxa"/>
             <w:tcBorders>
               <w:left w:val="single" w:sz="2" w:space="0" w:color="000000"/>
               <w:bottom w:val="single" w:sz="2" w:space="0" w:color="000000"/>
@@ -761,7 +761,7 @@
         <w:trPr/>
         <w:tc>
           <w:tcPr>
-            <w:tcW w:w="6651" w:type="dxa"/>
+            <w:tcW w:w="6650" w:type="dxa"/>
             <w:tcBorders>
               <w:left w:val="single" w:sz="2" w:space="0" w:color="000000"/>
               <w:bottom w:val="single" w:sz="2" w:space="0" w:color="000000"/>
@@ -802,7 +802,7 @@
         </w:tc>
         <w:tc>
           <w:tcPr>
-            <w:tcW w:w="1497" w:type="dxa"/>
+            <w:tcW w:w="1498" w:type="dxa"/>
             <w:tcBorders>
               <w:left w:val="single" w:sz="2" w:space="0" w:color="000000"/>
               <w:bottom w:val="single" w:sz="2" w:space="0" w:color="000000"/>
@@ -862,7 +862,7 @@
         <w:trPr/>
         <w:tc>
           <w:tcPr>
-            <w:tcW w:w="6651" w:type="dxa"/>
+            <w:tcW w:w="6650" w:type="dxa"/>
             <w:tcBorders>
               <w:left w:val="single" w:sz="2" w:space="0" w:color="000000"/>
               <w:bottom w:val="single" w:sz="2" w:space="0" w:color="000000"/>
@@ -903,7 +903,7 @@
         </w:tc>
         <w:tc>
           <w:tcPr>
-            <w:tcW w:w="1497" w:type="dxa"/>
+            <w:tcW w:w="1498" w:type="dxa"/>
             <w:tcBorders>
               <w:left w:val="single" w:sz="2" w:space="0" w:color="000000"/>
               <w:bottom w:val="single" w:sz="2" w:space="0" w:color="000000"/>
@@ -952,7 +952,7 @@
                 <w:szCs w:val="22"/>
                 <w:lang w:val="pl-PL"/>
               </w:rPr>
-              <w:t>19</w:t>
+              <w:t>4</w:t>
             </w:r>
           </w:p>
         </w:tc>
@@ -961,7 +961,7 @@
         <w:trPr/>
         <w:tc>
           <w:tcPr>
-            <w:tcW w:w="6651" w:type="dxa"/>
+            <w:tcW w:w="6650" w:type="dxa"/>
             <w:tcBorders>
               <w:left w:val="single" w:sz="2" w:space="0" w:color="000000"/>
               <w:bottom w:val="single" w:sz="2" w:space="0" w:color="000000"/>
@@ -988,7 +988,7 @@
         </w:tc>
         <w:tc>
           <w:tcPr>
-            <w:tcW w:w="1497" w:type="dxa"/>
+            <w:tcW w:w="1498" w:type="dxa"/>
             <w:tcBorders>
               <w:left w:val="single" w:sz="2" w:space="0" w:color="000000"/>
               <w:bottom w:val="single" w:sz="2" w:space="0" w:color="000000"/>
@@ -1046,7 +1046,7 @@
         <w:trPr/>
         <w:tc>
           <w:tcPr>
-            <w:tcW w:w="6651" w:type="dxa"/>
+            <w:tcW w:w="6650" w:type="dxa"/>
             <w:tcBorders>
               <w:left w:val="single" w:sz="2" w:space="0" w:color="000000"/>
               <w:bottom w:val="single" w:sz="2" w:space="0" w:color="000000"/>
@@ -1073,7 +1073,7 @@
         </w:tc>
         <w:tc>
           <w:tcPr>
-            <w:tcW w:w="1497" w:type="dxa"/>
+            <w:tcW w:w="1498" w:type="dxa"/>
             <w:tcBorders>
               <w:left w:val="single" w:sz="2" w:space="0" w:color="000000"/>
               <w:bottom w:val="single" w:sz="2" w:space="0" w:color="000000"/>
@@ -1133,7 +1133,7 @@
         <w:trPr/>
         <w:tc>
           <w:tcPr>
-            <w:tcW w:w="6651" w:type="dxa"/>
+            <w:tcW w:w="6650" w:type="dxa"/>
             <w:tcBorders>
               <w:left w:val="single" w:sz="2" w:space="0" w:color="000000"/>
               <w:bottom w:val="single" w:sz="2" w:space="0" w:color="000000"/>
@@ -1160,7 +1160,7 @@
         </w:tc>
         <w:tc>
           <w:tcPr>
-            <w:tcW w:w="1497" w:type="dxa"/>
+            <w:tcW w:w="1498" w:type="dxa"/>
             <w:tcBorders>
               <w:left w:val="single" w:sz="2" w:space="0" w:color="000000"/>
               <w:bottom w:val="single" w:sz="2" w:space="0" w:color="000000"/>
@@ -1218,7 +1218,7 @@
         <w:trPr/>
         <w:tc>
           <w:tcPr>
-            <w:tcW w:w="6651" w:type="dxa"/>
+            <w:tcW w:w="6650" w:type="dxa"/>
             <w:tcBorders>
               <w:left w:val="single" w:sz="2" w:space="0" w:color="000000"/>
               <w:bottom w:val="single" w:sz="2" w:space="0" w:color="000000"/>
@@ -1245,7 +1245,7 @@
         </w:tc>
         <w:tc>
           <w:tcPr>
-            <w:tcW w:w="1497" w:type="dxa"/>
+            <w:tcW w:w="1498" w:type="dxa"/>
             <w:tcBorders>
               <w:left w:val="single" w:sz="2" w:space="0" w:color="000000"/>
               <w:bottom w:val="single" w:sz="2" w:space="0" w:color="000000"/>
@@ -1304,7 +1304,7 @@
         <w:trPr/>
         <w:tc>
           <w:tcPr>
-            <w:tcW w:w="6651" w:type="dxa"/>
+            <w:tcW w:w="6650" w:type="dxa"/>
             <w:tcBorders>
               <w:left w:val="single" w:sz="2" w:space="0" w:color="000000"/>
               <w:bottom w:val="single" w:sz="2" w:space="0" w:color="000000"/>
@@ -1331,7 +1331,7 @@
         </w:tc>
         <w:tc>
           <w:tcPr>
-            <w:tcW w:w="1497" w:type="dxa"/>
+            <w:tcW w:w="1498" w:type="dxa"/>
             <w:tcBorders>
               <w:left w:val="single" w:sz="2" w:space="0" w:color="000000"/>
               <w:bottom w:val="single" w:sz="2" w:space="0" w:color="000000"/>
@@ -1389,7 +1389,7 @@
         <w:trPr/>
         <w:tc>
           <w:tcPr>
-            <w:tcW w:w="6651" w:type="dxa"/>
+            <w:tcW w:w="6650" w:type="dxa"/>
             <w:tcBorders>
               <w:left w:val="single" w:sz="2" w:space="0" w:color="000000"/>
               <w:bottom w:val="single" w:sz="2" w:space="0" w:color="000000"/>
@@ -1416,7 +1416,7 @@
         </w:tc>
         <w:tc>
           <w:tcPr>
-            <w:tcW w:w="1497" w:type="dxa"/>
+            <w:tcW w:w="1498" w:type="dxa"/>
             <w:tcBorders>
               <w:left w:val="single" w:sz="2" w:space="0" w:color="000000"/>
               <w:bottom w:val="single" w:sz="2" w:space="0" w:color="000000"/>
@@ -1474,33 +1474,33 @@
         <w:trPr/>
         <w:tc>
           <w:tcPr>
-            <w:tcW w:w="6651" w:type="dxa"/>
-            <w:tcBorders>
-              <w:left w:val="single" w:sz="2" w:space="0" w:color="000000"/>
-              <w:bottom w:val="single" w:sz="2" w:space="0" w:color="000000"/>
-            </w:tcBorders>
-          </w:tcPr>
-          <w:p>
-            <w:pPr>
-              <w:pStyle w:val="TableContents"/>
-              <w:rPr>
-                <w:sz w:val="22"/>
-                <w:szCs w:val="22"/>
-                <w:lang w:val="pl-PL"/>
-              </w:rPr>
-            </w:pPr>
-            <w:r>
-              <w:rPr>
-                <w:sz w:val="22"/>
-                <w:szCs w:val="22"/>
-                <w:lang w:val="pl-PL"/>
-              </w:rPr>
-            </w:r>
-          </w:p>
-        </w:tc>
-        <w:tc>
-          <w:tcPr>
-            <w:tcW w:w="1497" w:type="dxa"/>
+            <w:tcW w:w="6650" w:type="dxa"/>
+            <w:tcBorders>
+              <w:left w:val="single" w:sz="2" w:space="0" w:color="000000"/>
+              <w:bottom w:val="single" w:sz="2" w:space="0" w:color="000000"/>
+            </w:tcBorders>
+          </w:tcPr>
+          <w:p>
+            <w:pPr>
+              <w:pStyle w:val="TableContents"/>
+              <w:rPr>
+                <w:sz w:val="22"/>
+                <w:szCs w:val="22"/>
+                <w:lang w:val="pl-PL"/>
+              </w:rPr>
+            </w:pPr>
+            <w:r>
+              <w:rPr>
+                <w:sz w:val="22"/>
+                <w:szCs w:val="22"/>
+                <w:lang w:val="pl-PL"/>
+              </w:rPr>
+            </w:r>
+          </w:p>
+        </w:tc>
+        <w:tc>
+          <w:tcPr>
+            <w:tcW w:w="1498" w:type="dxa"/>
             <w:tcBorders>
               <w:left w:val="single" w:sz="2" w:space="0" w:color="000000"/>
               <w:bottom w:val="single" w:sz="2" w:space="0" w:color="000000"/>
@@ -1661,7 +1661,7 @@
     </w:r>
     <w:r>
       <w:rPr/>
-      <w:t>20.05.2026</w:t>
+      <w:t>21.05.2026</w:t>
     </w:r>
     <w:r>
       <w:rPr/>
@@ -1706,7 +1706,7 @@
     </w:r>
     <w:r>
       <w:rPr/>
-      <w:t>20.05.2026</w:t>
+      <w:t>21.05.2026</w:t>
     </w:r>
     <w:r>
       <w:rPr/>
@@ -1750,7 +1750,7 @@
     <w:pPr>
       <w:widowControl/>
       <w:suppressAutoHyphens w:val="true"/>
-      <w:overflowPunct w:val="false"/>
+      <w:overflowPunct w:val="true"/>
       <w:bidi w:val="0"/>
       <w:spacing w:before="0" w:after="0"/>
       <w:jc w:val="left"/>
@@ -1788,8 +1788,8 @@
     <w:qFormat/>
     <w:rPr/>
   </w:style>
-  <w:style w:type="character" w:styleId="Bullets">
-    <w:name w:val="Bullets"/>
+  <w:style w:type="character" w:styleId="Bulletsuser">
+    <w:name w:val="Bullets (user)"/>
     <w:qFormat/>
     <w:rPr>
       <w:rFonts w:ascii="OpenSymbol" w:hAnsi="OpenSymbol" w:eastAsia="OpenSymbol" w:cs="OpenSymbol"/>
@@ -1861,7 +1861,7 @@
     <w:pPr>
       <w:widowControl/>
       <w:suppressAutoHyphens w:val="true"/>
-      <w:overflowPunct w:val="false"/>
+      <w:overflowPunct w:val="true"/>
       <w:bidi w:val="0"/>
       <w:spacing w:before="0" w:after="0"/>
       <w:jc w:val="left"/>

</xml_diff>

<commit_message>
Raport, to be completed and final checklist
</commit_message>
<xml_diff>
--- a/doc/checklist.docx
+++ b/doc/checklist.docx
@@ -66,7 +66,7 @@
       </w:r>
       <w:r>
         <w:rPr/>
-        <w:t>21.05.2026</w:t>
+        <w:t>31.08.2026</w:t>
       </w:r>
       <w:r>
         <w:rPr/>
@@ -96,15 +96,15 @@
         </w:tblCellMar>
       </w:tblPr>
       <w:tblGrid>
-        <w:gridCol w:w="6650"/>
-        <w:gridCol w:w="1498"/>
+        <w:gridCol w:w="6647"/>
+        <w:gridCol w:w="1501"/>
         <w:gridCol w:w="1495"/>
       </w:tblGrid>
       <w:tr>
         <w:trPr/>
         <w:tc>
           <w:tcPr>
-            <w:tcW w:w="6650" w:type="dxa"/>
+            <w:tcW w:w="6647" w:type="dxa"/>
             <w:tcBorders>
               <w:top w:val="single" w:sz="2" w:space="0" w:color="000000"/>
               <w:left w:val="single" w:sz="2" w:space="0" w:color="000000"/>
@@ -116,18 +116,6 @@
             <w:pPr>
               <w:pStyle w:val="TableContents"/>
               <w:jc w:val="center"/>
-              <w:rPr>
-                <w:b/>
-                <w:bCs/>
-                <w:i/>
-                <w:i/>
-                <w:iCs/>
-                <w:sz w:val="22"/>
-                <w:szCs w:val="22"/>
-                <w:lang w:val="pl-PL"/>
-              </w:rPr>
-            </w:pPr>
-            <w:r>
               <w:rPr>
                 <w:b/>
                 <w:bCs/>
@@ -137,34 +125,6 @@
                 <w:szCs w:val="22"/>
                 <w:lang w:val="pl-PL"/>
               </w:rPr>
-              <w:t>Pytanie</w:t>
-            </w:r>
-          </w:p>
-        </w:tc>
-        <w:tc>
-          <w:tcPr>
-            <w:tcW w:w="1498" w:type="dxa"/>
-            <w:tcBorders>
-              <w:top w:val="single" w:sz="2" w:space="0" w:color="000000"/>
-              <w:left w:val="single" w:sz="2" w:space="0" w:color="000000"/>
-              <w:bottom w:val="single" w:sz="2" w:space="0" w:color="000000"/>
-            </w:tcBorders>
-            <w:vAlign w:val="center"/>
-          </w:tcPr>
-          <w:p>
-            <w:pPr>
-              <w:pStyle w:val="TableContents"/>
-              <w:jc w:val="center"/>
-              <w:rPr>
-                <w:b/>
-                <w:bCs/>
-                <w:i/>
-                <w:i/>
-                <w:iCs/>
-                <w:sz w:val="22"/>
-                <w:szCs w:val="22"/>
-                <w:lang w:val="pl-PL"/>
-              </w:rPr>
             </w:pPr>
             <w:r>
               <w:rPr>
@@ -176,18 +136,17 @@
                 <w:szCs w:val="22"/>
                 <w:lang w:val="pl-PL"/>
               </w:rPr>
-              <w:t>Oczekiwana odpowiedź</w:t>
-            </w:r>
-          </w:p>
-        </w:tc>
-        <w:tc>
-          <w:tcPr>
-            <w:tcW w:w="1495" w:type="dxa"/>
+              <w:t>Pytanie</w:t>
+            </w:r>
+          </w:p>
+        </w:tc>
+        <w:tc>
+          <w:tcPr>
+            <w:tcW w:w="1501" w:type="dxa"/>
             <w:tcBorders>
               <w:top w:val="single" w:sz="2" w:space="0" w:color="000000"/>
               <w:left w:val="single" w:sz="2" w:space="0" w:color="000000"/>
               <w:bottom w:val="single" w:sz="2" w:space="0" w:color="000000"/>
-              <w:right w:val="single" w:sz="2" w:space="0" w:color="000000"/>
             </w:tcBorders>
             <w:vAlign w:val="center"/>
           </w:tcPr>
@@ -195,18 +154,6 @@
             <w:pPr>
               <w:pStyle w:val="TableContents"/>
               <w:jc w:val="center"/>
-              <w:rPr>
-                <w:b/>
-                <w:bCs/>
-                <w:i/>
-                <w:i/>
-                <w:iCs/>
-                <w:sz w:val="22"/>
-                <w:szCs w:val="22"/>
-                <w:lang w:val="pl-PL"/>
-              </w:rPr>
-            </w:pPr>
-            <w:r>
               <w:rPr>
                 <w:b/>
                 <w:bCs/>
@@ -216,6 +163,56 @@
                 <w:szCs w:val="22"/>
                 <w:lang w:val="pl-PL"/>
               </w:rPr>
+            </w:pPr>
+            <w:r>
+              <w:rPr>
+                <w:b/>
+                <w:bCs/>
+                <w:i/>
+                <w:iCs/>
+                <w:sz w:val="22"/>
+                <w:szCs w:val="22"/>
+                <w:lang w:val="pl-PL"/>
+              </w:rPr>
+              <w:t>Oczekiwana odpowiedź</w:t>
+            </w:r>
+          </w:p>
+        </w:tc>
+        <w:tc>
+          <w:tcPr>
+            <w:tcW w:w="1495" w:type="dxa"/>
+            <w:tcBorders>
+              <w:top w:val="single" w:sz="2" w:space="0" w:color="000000"/>
+              <w:left w:val="single" w:sz="2" w:space="0" w:color="000000"/>
+              <w:bottom w:val="single" w:sz="2" w:space="0" w:color="000000"/>
+              <w:right w:val="single" w:sz="2" w:space="0" w:color="000000"/>
+            </w:tcBorders>
+            <w:vAlign w:val="center"/>
+          </w:tcPr>
+          <w:p>
+            <w:pPr>
+              <w:pStyle w:val="TableContents"/>
+              <w:jc w:val="center"/>
+              <w:rPr>
+                <w:b/>
+                <w:bCs/>
+                <w:i/>
+                <w:iCs/>
+                <w:sz w:val="22"/>
+                <w:szCs w:val="22"/>
+                <w:lang w:val="pl-PL"/>
+              </w:rPr>
+            </w:pPr>
+            <w:r>
+              <w:rPr>
+                <w:b/>
+                <w:bCs/>
+                <w:i/>
+                <w:iCs/>
+                <w:sz w:val="22"/>
+                <w:szCs w:val="22"/>
+                <w:lang w:val="pl-PL"/>
+              </w:rPr>
               <w:t>Twoja odpowiedź</w:t>
             </w:r>
           </w:p>
@@ -225,7 +222,7 @@
         <w:trPr/>
         <w:tc>
           <w:tcPr>
-            <w:tcW w:w="6650" w:type="dxa"/>
+            <w:tcW w:w="6647" w:type="dxa"/>
             <w:tcBorders>
               <w:left w:val="single" w:sz="2" w:space="0" w:color="000000"/>
               <w:bottom w:val="single" w:sz="2" w:space="0" w:color="000000"/>
@@ -252,7 +249,7 @@
         </w:tc>
         <w:tc>
           <w:tcPr>
-            <w:tcW w:w="1498" w:type="dxa"/>
+            <w:tcW w:w="1501" w:type="dxa"/>
             <w:tcBorders>
               <w:left w:val="single" w:sz="2" w:space="0" w:color="000000"/>
               <w:bottom w:val="single" w:sz="2" w:space="0" w:color="000000"/>
@@ -312,7 +309,7 @@
         <w:trPr/>
         <w:tc>
           <w:tcPr>
-            <w:tcW w:w="6650" w:type="dxa"/>
+            <w:tcW w:w="6647" w:type="dxa"/>
             <w:tcBorders>
               <w:left w:val="single" w:sz="2" w:space="0" w:color="000000"/>
               <w:bottom w:val="single" w:sz="2" w:space="0" w:color="000000"/>
@@ -357,7 +354,7 @@
         </w:tc>
         <w:tc>
           <w:tcPr>
-            <w:tcW w:w="1498" w:type="dxa"/>
+            <w:tcW w:w="1501" w:type="dxa"/>
             <w:tcBorders>
               <w:left w:val="single" w:sz="2" w:space="0" w:color="000000"/>
               <w:bottom w:val="single" w:sz="2" w:space="0" w:color="000000"/>
@@ -417,7 +414,7 @@
         <w:trPr/>
         <w:tc>
           <w:tcPr>
-            <w:tcW w:w="6650" w:type="dxa"/>
+            <w:tcW w:w="6647" w:type="dxa"/>
             <w:tcBorders>
               <w:left w:val="single" w:sz="2" w:space="0" w:color="000000"/>
               <w:bottom w:val="single" w:sz="2" w:space="0" w:color="000000"/>
@@ -444,7 +441,7 @@
         </w:tc>
         <w:tc>
           <w:tcPr>
-            <w:tcW w:w="1498" w:type="dxa"/>
+            <w:tcW w:w="1501" w:type="dxa"/>
             <w:tcBorders>
               <w:left w:val="single" w:sz="2" w:space="0" w:color="000000"/>
               <w:bottom w:val="single" w:sz="2" w:space="0" w:color="000000"/>
@@ -495,6 +492,7 @@
                 <w:szCs w:val="22"/>
                 <w:lang w:val="pl-PL"/>
               </w:rPr>
+              <w:t>TAK</w:t>
             </w:r>
           </w:p>
         </w:tc>
@@ -503,7 +501,7 @@
         <w:trPr/>
         <w:tc>
           <w:tcPr>
-            <w:tcW w:w="6650" w:type="dxa"/>
+            <w:tcW w:w="6647" w:type="dxa"/>
             <w:tcBorders>
               <w:left w:val="single" w:sz="2" w:space="0" w:color="000000"/>
               <w:bottom w:val="single" w:sz="2" w:space="0" w:color="000000"/>
@@ -530,7 +528,7 @@
         </w:tc>
         <w:tc>
           <w:tcPr>
-            <w:tcW w:w="1498" w:type="dxa"/>
+            <w:tcW w:w="1501" w:type="dxa"/>
             <w:tcBorders>
               <w:left w:val="single" w:sz="2" w:space="0" w:color="000000"/>
               <w:bottom w:val="single" w:sz="2" w:space="0" w:color="000000"/>
@@ -581,6 +579,7 @@
                 <w:szCs w:val="22"/>
                 <w:lang w:val="pl-PL"/>
               </w:rPr>
+              <w:t>TAK</w:t>
             </w:r>
           </w:p>
         </w:tc>
@@ -589,7 +588,7 @@
         <w:trPr/>
         <w:tc>
           <w:tcPr>
-            <w:tcW w:w="6650" w:type="dxa"/>
+            <w:tcW w:w="6647" w:type="dxa"/>
             <w:tcBorders>
               <w:left w:val="single" w:sz="2" w:space="0" w:color="000000"/>
               <w:bottom w:val="single" w:sz="2" w:space="0" w:color="000000"/>
@@ -616,7 +615,7 @@
         </w:tc>
         <w:tc>
           <w:tcPr>
-            <w:tcW w:w="1498" w:type="dxa"/>
+            <w:tcW w:w="1501" w:type="dxa"/>
             <w:tcBorders>
               <w:left w:val="single" w:sz="2" w:space="0" w:color="000000"/>
               <w:bottom w:val="single" w:sz="2" w:space="0" w:color="000000"/>
@@ -674,7 +673,7 @@
         <w:trPr/>
         <w:tc>
           <w:tcPr>
-            <w:tcW w:w="6650" w:type="dxa"/>
+            <w:tcW w:w="6647" w:type="dxa"/>
             <w:tcBorders>
               <w:left w:val="single" w:sz="2" w:space="0" w:color="000000"/>
               <w:bottom w:val="single" w:sz="2" w:space="0" w:color="000000"/>
@@ -701,7 +700,7 @@
         </w:tc>
         <w:tc>
           <w:tcPr>
-            <w:tcW w:w="1498" w:type="dxa"/>
+            <w:tcW w:w="1501" w:type="dxa"/>
             <w:tcBorders>
               <w:left w:val="single" w:sz="2" w:space="0" w:color="000000"/>
               <w:bottom w:val="single" w:sz="2" w:space="0" w:color="000000"/>
@@ -761,7 +760,7 @@
         <w:trPr/>
         <w:tc>
           <w:tcPr>
-            <w:tcW w:w="6650" w:type="dxa"/>
+            <w:tcW w:w="6647" w:type="dxa"/>
             <w:tcBorders>
               <w:left w:val="single" w:sz="2" w:space="0" w:color="000000"/>
               <w:bottom w:val="single" w:sz="2" w:space="0" w:color="000000"/>
@@ -802,7 +801,7 @@
         </w:tc>
         <w:tc>
           <w:tcPr>
-            <w:tcW w:w="1498" w:type="dxa"/>
+            <w:tcW w:w="1501" w:type="dxa"/>
             <w:tcBorders>
               <w:left w:val="single" w:sz="2" w:space="0" w:color="000000"/>
               <w:bottom w:val="single" w:sz="2" w:space="0" w:color="000000"/>
@@ -862,7 +861,7 @@
         <w:trPr/>
         <w:tc>
           <w:tcPr>
-            <w:tcW w:w="6650" w:type="dxa"/>
+            <w:tcW w:w="6647" w:type="dxa"/>
             <w:tcBorders>
               <w:left w:val="single" w:sz="2" w:space="0" w:color="000000"/>
               <w:bottom w:val="single" w:sz="2" w:space="0" w:color="000000"/>
@@ -903,7 +902,7 @@
         </w:tc>
         <w:tc>
           <w:tcPr>
-            <w:tcW w:w="1498" w:type="dxa"/>
+            <w:tcW w:w="1501" w:type="dxa"/>
             <w:tcBorders>
               <w:left w:val="single" w:sz="2" w:space="0" w:color="000000"/>
               <w:bottom w:val="single" w:sz="2" w:space="0" w:color="000000"/>
@@ -952,7 +951,7 @@
                 <w:szCs w:val="22"/>
                 <w:lang w:val="pl-PL"/>
               </w:rPr>
-              <w:t>4</w:t>
+              <w:t>0</w:t>
             </w:r>
           </w:p>
         </w:tc>
@@ -961,7 +960,7 @@
         <w:trPr/>
         <w:tc>
           <w:tcPr>
-            <w:tcW w:w="6650" w:type="dxa"/>
+            <w:tcW w:w="6647" w:type="dxa"/>
             <w:tcBorders>
               <w:left w:val="single" w:sz="2" w:space="0" w:color="000000"/>
               <w:bottom w:val="single" w:sz="2" w:space="0" w:color="000000"/>
@@ -988,7 +987,7 @@
         </w:tc>
         <w:tc>
           <w:tcPr>
-            <w:tcW w:w="1498" w:type="dxa"/>
+            <w:tcW w:w="1501" w:type="dxa"/>
             <w:tcBorders>
               <w:left w:val="single" w:sz="2" w:space="0" w:color="000000"/>
               <w:bottom w:val="single" w:sz="2" w:space="0" w:color="000000"/>
@@ -1046,7 +1045,7 @@
         <w:trPr/>
         <w:tc>
           <w:tcPr>
-            <w:tcW w:w="6650" w:type="dxa"/>
+            <w:tcW w:w="6647" w:type="dxa"/>
             <w:tcBorders>
               <w:left w:val="single" w:sz="2" w:space="0" w:color="000000"/>
               <w:bottom w:val="single" w:sz="2" w:space="0" w:color="000000"/>
@@ -1073,7 +1072,7 @@
         </w:tc>
         <w:tc>
           <w:tcPr>
-            <w:tcW w:w="1498" w:type="dxa"/>
+            <w:tcW w:w="1501" w:type="dxa"/>
             <w:tcBorders>
               <w:left w:val="single" w:sz="2" w:space="0" w:color="000000"/>
               <w:bottom w:val="single" w:sz="2" w:space="0" w:color="000000"/>
@@ -1133,7 +1132,7 @@
         <w:trPr/>
         <w:tc>
           <w:tcPr>
-            <w:tcW w:w="6650" w:type="dxa"/>
+            <w:tcW w:w="6647" w:type="dxa"/>
             <w:tcBorders>
               <w:left w:val="single" w:sz="2" w:space="0" w:color="000000"/>
               <w:bottom w:val="single" w:sz="2" w:space="0" w:color="000000"/>
@@ -1160,7 +1159,7 @@
         </w:tc>
         <w:tc>
           <w:tcPr>
-            <w:tcW w:w="1498" w:type="dxa"/>
+            <w:tcW w:w="1501" w:type="dxa"/>
             <w:tcBorders>
               <w:left w:val="single" w:sz="2" w:space="0" w:color="000000"/>
               <w:bottom w:val="single" w:sz="2" w:space="0" w:color="000000"/>
@@ -1218,7 +1217,7 @@
         <w:trPr/>
         <w:tc>
           <w:tcPr>
-            <w:tcW w:w="6650" w:type="dxa"/>
+            <w:tcW w:w="6647" w:type="dxa"/>
             <w:tcBorders>
               <w:left w:val="single" w:sz="2" w:space="0" w:color="000000"/>
               <w:bottom w:val="single" w:sz="2" w:space="0" w:color="000000"/>
@@ -1245,7 +1244,7 @@
         </w:tc>
         <w:tc>
           <w:tcPr>
-            <w:tcW w:w="1498" w:type="dxa"/>
+            <w:tcW w:w="1501" w:type="dxa"/>
             <w:tcBorders>
               <w:left w:val="single" w:sz="2" w:space="0" w:color="000000"/>
               <w:bottom w:val="single" w:sz="2" w:space="0" w:color="000000"/>
@@ -1296,6 +1295,7 @@
                 <w:szCs w:val="22"/>
                 <w:lang w:val="pl-PL"/>
               </w:rPr>
+              <w:t>TAK</w:t>
             </w:r>
           </w:p>
         </w:tc>
@@ -1304,7 +1304,7 @@
         <w:trPr/>
         <w:tc>
           <w:tcPr>
-            <w:tcW w:w="6650" w:type="dxa"/>
+            <w:tcW w:w="6647" w:type="dxa"/>
             <w:tcBorders>
               <w:left w:val="single" w:sz="2" w:space="0" w:color="000000"/>
               <w:bottom w:val="single" w:sz="2" w:space="0" w:color="000000"/>
@@ -1331,7 +1331,7 @@
         </w:tc>
         <w:tc>
           <w:tcPr>
-            <w:tcW w:w="1498" w:type="dxa"/>
+            <w:tcW w:w="1501" w:type="dxa"/>
             <w:tcBorders>
               <w:left w:val="single" w:sz="2" w:space="0" w:color="000000"/>
               <w:bottom w:val="single" w:sz="2" w:space="0" w:color="000000"/>
@@ -1389,7 +1389,7 @@
         <w:trPr/>
         <w:tc>
           <w:tcPr>
-            <w:tcW w:w="6650" w:type="dxa"/>
+            <w:tcW w:w="6647" w:type="dxa"/>
             <w:tcBorders>
               <w:left w:val="single" w:sz="2" w:space="0" w:color="000000"/>
               <w:bottom w:val="single" w:sz="2" w:space="0" w:color="000000"/>
@@ -1416,7 +1416,7 @@
         </w:tc>
         <w:tc>
           <w:tcPr>
-            <w:tcW w:w="1498" w:type="dxa"/>
+            <w:tcW w:w="1501" w:type="dxa"/>
             <w:tcBorders>
               <w:left w:val="single" w:sz="2" w:space="0" w:color="000000"/>
               <w:bottom w:val="single" w:sz="2" w:space="0" w:color="000000"/>
@@ -1466,89 +1466,6 @@
                 <w:lang w:val="pl-PL"/>
               </w:rPr>
               <w:t>TAK</w:t>
-            </w:r>
-          </w:p>
-        </w:tc>
-      </w:tr>
-      <w:tr>
-        <w:trPr/>
-        <w:tc>
-          <w:tcPr>
-            <w:tcW w:w="6650" w:type="dxa"/>
-            <w:tcBorders>
-              <w:left w:val="single" w:sz="2" w:space="0" w:color="000000"/>
-              <w:bottom w:val="single" w:sz="2" w:space="0" w:color="000000"/>
-            </w:tcBorders>
-          </w:tcPr>
-          <w:p>
-            <w:pPr>
-              <w:pStyle w:val="TableContents"/>
-              <w:rPr>
-                <w:sz w:val="22"/>
-                <w:szCs w:val="22"/>
-                <w:lang w:val="pl-PL"/>
-              </w:rPr>
-            </w:pPr>
-            <w:r>
-              <w:rPr>
-                <w:sz w:val="22"/>
-                <w:szCs w:val="22"/>
-                <w:lang w:val="pl-PL"/>
-              </w:rPr>
-            </w:r>
-          </w:p>
-        </w:tc>
-        <w:tc>
-          <w:tcPr>
-            <w:tcW w:w="1498" w:type="dxa"/>
-            <w:tcBorders>
-              <w:left w:val="single" w:sz="2" w:space="0" w:color="000000"/>
-              <w:bottom w:val="single" w:sz="2" w:space="0" w:color="000000"/>
-            </w:tcBorders>
-          </w:tcPr>
-          <w:p>
-            <w:pPr>
-              <w:pStyle w:val="TableContents"/>
-              <w:rPr>
-                <w:sz w:val="22"/>
-                <w:szCs w:val="22"/>
-                <w:lang w:val="pl-PL"/>
-              </w:rPr>
-            </w:pPr>
-            <w:r>
-              <w:rPr>
-                <w:sz w:val="22"/>
-                <w:szCs w:val="22"/>
-                <w:lang w:val="pl-PL"/>
-              </w:rPr>
-            </w:r>
-          </w:p>
-        </w:tc>
-        <w:tc>
-          <w:tcPr>
-            <w:tcW w:w="1495" w:type="dxa"/>
-            <w:tcBorders>
-              <w:left w:val="single" w:sz="2" w:space="0" w:color="000000"/>
-              <w:bottom w:val="single" w:sz="2" w:space="0" w:color="000000"/>
-              <w:right w:val="single" w:sz="2" w:space="0" w:color="000000"/>
-            </w:tcBorders>
-          </w:tcPr>
-          <w:p>
-            <w:pPr>
-              <w:pStyle w:val="TableContents"/>
-              <w:jc w:val="center"/>
-              <w:rPr>
-                <w:sz w:val="22"/>
-                <w:szCs w:val="22"/>
-                <w:lang w:val="pl-PL"/>
-              </w:rPr>
-            </w:pPr>
-            <w:r>
-              <w:rPr>
-                <w:sz w:val="22"/>
-                <w:szCs w:val="22"/>
-                <w:lang w:val="pl-PL"/>
-              </w:rPr>
             </w:r>
           </w:p>
         </w:tc>
@@ -1661,7 +1578,7 @@
     </w:r>
     <w:r>
       <w:rPr/>
-      <w:t>21.05.2026</w:t>
+      <w:t>31.08.2026</w:t>
     </w:r>
     <w:r>
       <w:rPr/>
@@ -1706,7 +1623,7 @@
     </w:r>
     <w:r>
       <w:rPr/>
-      <w:t>21.05.2026</w:t>
+      <w:t>31.08.2026</w:t>
     </w:r>
     <w:r>
       <w:rPr/>
@@ -1750,7 +1667,7 @@
     <w:pPr>
       <w:widowControl/>
       <w:suppressAutoHyphens w:val="true"/>
-      <w:overflowPunct w:val="true"/>
+      <w:overflowPunct w:val="false"/>
       <w:bidi w:val="0"/>
       <w:spacing w:before="0" w:after="0"/>
       <w:jc w:val="left"/>
@@ -1788,8 +1705,8 @@
     <w:qFormat/>
     <w:rPr/>
   </w:style>
-  <w:style w:type="character" w:styleId="Bulletsuser">
-    <w:name w:val="Bullets (user)"/>
+  <w:style w:type="character" w:styleId="Bullets">
+    <w:name w:val="Bullets"/>
     <w:qFormat/>
     <w:rPr>
       <w:rFonts w:ascii="OpenSymbol" w:hAnsi="OpenSymbol" w:eastAsia="OpenSymbol" w:cs="OpenSymbol"/>
@@ -1861,7 +1778,7 @@
     <w:pPr>
       <w:widowControl/>
       <w:suppressAutoHyphens w:val="true"/>
-      <w:overflowPunct w:val="true"/>
+      <w:overflowPunct w:val="false"/>
       <w:bidi w:val="0"/>
       <w:spacing w:before="0" w:after="0"/>
       <w:jc w:val="left"/>

</xml_diff>